<commit_message>
Update Apply_System_Context.docx and MEMORY.md with GitHub Secrets Matrix
</commit_message>
<xml_diff>
--- a/Apply_System_Context.docx
+++ b/Apply_System_Context.docx
@@ -250,7 +250,7 @@
           <w:color w:val="2B6CB0"/>
           <w:sz w:val="32"/>
         </w:rPr>
-        <w:t>3. Authentication &amp; CI/CD Security Architecture (SSH Key vs Password)</w:t>
+        <w:t>3. GitHub Actions CI/CD Secrets &amp; Variables Specification</w:t>
       </w:r>
     </w:p>
     <w:p>
@@ -263,78 +263,421 @@
           <w:color w:val="2D3748"/>
           <w:sz w:val="22"/>
         </w:rPr>
-        <w:t>To enforce production security best practices, GitHub Actions CI/CD automated deployment uses private SSH keys (VPS_SSH_KEY) instead of plain text user passwords.</w:t>
+        <w:t>The following table details the configuration parameters for GitHub Secrets and Variables, distinguishing between Local PC execution and Cloud VPS deployment:</w:t>
       </w:r>
     </w:p>
+    <w:tbl>
+      <w:tblPr>
+        <w:tblW w:type="auto" w:w="0"/>
+        <w:jc w:val="center"/>
+        <w:tblLayout w:type="fixed"/>
+        <w:tblLook w:firstColumn="1" w:firstRow="1" w:lastColumn="0" w:lastRow="0" w:noHBand="0" w:noVBand="1" w:val="04A0"/>
+      </w:tblPr>
+      <w:tblGrid>
+        <w:gridCol w:w="2340"/>
+        <w:gridCol w:w="2340"/>
+        <w:gridCol w:w="2340"/>
+        <w:gridCol w:w="2340"/>
+      </w:tblGrid>
+      <w:tr>
+        <w:tc>
+          <w:tcPr>
+            <w:tcW w:type="dxa" w:w="2340"/>
+            <w:shd w:fill="1A365D"/>
+          </w:tcPr>
+          <w:p>
+            <w:pPr>
+              <w:jc w:val="center"/>
+            </w:pPr>
+            <w:r>
+              <w:rPr>
+                <w:rFonts w:ascii="Arial" w:hAnsi="Arial"/>
+                <w:b/>
+                <w:color w:val="FFFFFF"/>
+                <w:sz w:val="19"/>
+              </w:rPr>
+              <w:t>Secret / Variable</w:t>
+            </w:r>
+          </w:p>
+        </w:tc>
+        <w:tc>
+          <w:tcPr>
+            <w:tcW w:type="dxa" w:w="2340"/>
+            <w:shd w:fill="1A365D"/>
+          </w:tcPr>
+          <w:p>
+            <w:pPr>
+              <w:jc w:val="center"/>
+            </w:pPr>
+            <w:r>
+              <w:rPr>
+                <w:rFonts w:ascii="Arial" w:hAnsi="Arial"/>
+                <w:b/>
+                <w:color w:val="FFFFFF"/>
+                <w:sz w:val="19"/>
+              </w:rPr>
+              <w:t>Value for Local PC</w:t>
+            </w:r>
+          </w:p>
+        </w:tc>
+        <w:tc>
+          <w:tcPr>
+            <w:tcW w:type="dxa" w:w="2340"/>
+            <w:shd w:fill="1A365D"/>
+          </w:tcPr>
+          <w:p>
+            <w:pPr>
+              <w:jc w:val="center"/>
+            </w:pPr>
+            <w:r>
+              <w:rPr>
+                <w:rFonts w:ascii="Arial" w:hAnsi="Arial"/>
+                <w:b/>
+                <w:color w:val="FFFFFF"/>
+                <w:sz w:val="19"/>
+              </w:rPr>
+              <w:t>Value for Cloud Server (VPS)</w:t>
+            </w:r>
+          </w:p>
+        </w:tc>
+        <w:tc>
+          <w:tcPr>
+            <w:tcW w:type="dxa" w:w="2340"/>
+            <w:shd w:fill="1A365D"/>
+          </w:tcPr>
+          <w:p>
+            <w:pPr>
+              <w:jc w:val="center"/>
+            </w:pPr>
+            <w:r>
+              <w:rPr>
+                <w:rFonts w:ascii="Arial" w:hAnsi="Arial"/>
+                <w:b/>
+                <w:color w:val="FFFFFF"/>
+                <w:sz w:val="19"/>
+              </w:rPr>
+              <w:t>Brief Explanation</w:t>
+            </w:r>
+          </w:p>
+        </w:tc>
+      </w:tr>
+      <w:tr>
+        <w:tc>
+          <w:tcPr>
+            <w:tcW w:type="dxa" w:w="1728"/>
+            <w:shd w:fill="F7FAFC"/>
+          </w:tcPr>
+          <w:p>
+            <w:r>
+              <w:rPr>
+                <w:rFonts w:ascii="Calibri" w:hAnsi="Calibri"/>
+                <w:color w:val="2D3748"/>
+                <w:sz w:val="19"/>
+              </w:rPr>
+              <w:t>VPS_HOST</w:t>
+            </w:r>
+          </w:p>
+        </w:tc>
+        <w:tc>
+          <w:tcPr>
+            <w:tcW w:type="dxa" w:w="2592"/>
+            <w:shd w:fill="F7FAFC"/>
+          </w:tcPr>
+          <w:p>
+            <w:r>
+              <w:rPr>
+                <w:rFonts w:ascii="Calibri" w:hAnsi="Calibri"/>
+                <w:color w:val="2D3748"/>
+                <w:sz w:val="19"/>
+              </w:rPr>
+              <w:t>Not Needed (Private 192.168.x.x from ipconfig cannot be reached by GitHub)</w:t>
+            </w:r>
+          </w:p>
+        </w:tc>
+        <w:tc>
+          <w:tcPr>
+            <w:tcW w:type="dxa" w:w="2592"/>
+            <w:shd w:fill="F7FAFC"/>
+          </w:tcPr>
+          <w:p>
+            <w:r>
+              <w:rPr>
+                <w:rFonts w:ascii="Calibri" w:hAnsi="Calibri"/>
+                <w:color w:val="2D3748"/>
+                <w:sz w:val="19"/>
+              </w:rPr>
+              <w:t>Public Server IP (e.g. 142.93.xxx.xxx)</w:t>
+            </w:r>
+          </w:p>
+        </w:tc>
+        <w:tc>
+          <w:tcPr>
+            <w:tcW w:type="dxa" w:w="2448"/>
+            <w:shd w:fill="F7FAFC"/>
+          </w:tcPr>
+          <w:p>
+            <w:r>
+              <w:rPr>
+                <w:rFonts w:ascii="Calibri" w:hAnsi="Calibri"/>
+                <w:color w:val="2D3748"/>
+                <w:sz w:val="19"/>
+              </w:rPr>
+              <w:t>The target server IP where your code deploys.</w:t>
+            </w:r>
+          </w:p>
+        </w:tc>
+      </w:tr>
+      <w:tr>
+        <w:tc>
+          <w:tcPr>
+            <w:tcW w:type="dxa" w:w="1728"/>
+            <w:shd w:fill="FFFFFF"/>
+          </w:tcPr>
+          <w:p>
+            <w:r>
+              <w:rPr>
+                <w:rFonts w:ascii="Calibri" w:hAnsi="Calibri"/>
+                <w:color w:val="2D3748"/>
+                <w:sz w:val="19"/>
+              </w:rPr>
+              <w:t>VPS_USER</w:t>
+            </w:r>
+          </w:p>
+        </w:tc>
+        <w:tc>
+          <w:tcPr>
+            <w:tcW w:type="dxa" w:w="2592"/>
+            <w:shd w:fill="FFFFFF"/>
+          </w:tcPr>
+          <w:p>
+            <w:r>
+              <w:rPr>
+                <w:rFonts w:ascii="Calibri" w:hAnsi="Calibri"/>
+                <w:color w:val="2D3748"/>
+                <w:sz w:val="19"/>
+              </w:rPr>
+              <w:t>pradeep</w:t>
+            </w:r>
+          </w:p>
+        </w:tc>
+        <w:tc>
+          <w:tcPr>
+            <w:tcW w:type="dxa" w:w="2592"/>
+            <w:shd w:fill="FFFFFF"/>
+          </w:tcPr>
+          <w:p>
+            <w:r>
+              <w:rPr>
+                <w:rFonts w:ascii="Calibri" w:hAnsi="Calibri"/>
+                <w:color w:val="2D3748"/>
+                <w:sz w:val="19"/>
+              </w:rPr>
+              <w:t>root or ubuntu</w:t>
+            </w:r>
+          </w:p>
+        </w:tc>
+        <w:tc>
+          <w:tcPr>
+            <w:tcW w:type="dxa" w:w="2448"/>
+            <w:shd w:fill="FFFFFF"/>
+          </w:tcPr>
+          <w:p>
+            <w:r>
+              <w:rPr>
+                <w:rFonts w:ascii="Calibri" w:hAnsi="Calibri"/>
+                <w:color w:val="2D3748"/>
+                <w:sz w:val="19"/>
+              </w:rPr>
+              <w:t>The SSH username on the target server.</w:t>
+            </w:r>
+          </w:p>
+        </w:tc>
+      </w:tr>
+      <w:tr>
+        <w:tc>
+          <w:tcPr>
+            <w:tcW w:type="dxa" w:w="1728"/>
+            <w:shd w:fill="F7FAFC"/>
+          </w:tcPr>
+          <w:p>
+            <w:r>
+              <w:rPr>
+                <w:rFonts w:ascii="Calibri" w:hAnsi="Calibri"/>
+                <w:color w:val="2D3748"/>
+                <w:sz w:val="19"/>
+              </w:rPr>
+              <w:t>VPS_SSH_KEY</w:t>
+            </w:r>
+          </w:p>
+        </w:tc>
+        <w:tc>
+          <w:tcPr>
+            <w:tcW w:type="dxa" w:w="2592"/>
+            <w:shd w:fill="F7FAFC"/>
+          </w:tcPr>
+          <w:p>
+            <w:r>
+              <w:rPr>
+                <w:rFonts w:ascii="Calibri" w:hAnsi="Calibri"/>
+                <w:color w:val="2D3748"/>
+                <w:sz w:val="19"/>
+              </w:rPr>
+              <w:t>Generated via ssh-keygen</w:t>
+            </w:r>
+          </w:p>
+        </w:tc>
+        <w:tc>
+          <w:tcPr>
+            <w:tcW w:type="dxa" w:w="2592"/>
+            <w:shd w:fill="F7FAFC"/>
+          </w:tcPr>
+          <w:p>
+            <w:r>
+              <w:rPr>
+                <w:rFonts w:ascii="Calibri" w:hAnsi="Calibri"/>
+                <w:color w:val="2D3748"/>
+                <w:sz w:val="19"/>
+              </w:rPr>
+              <w:t>Content of ~/.ssh/id_rsa</w:t>
+            </w:r>
+          </w:p>
+        </w:tc>
+        <w:tc>
+          <w:tcPr>
+            <w:tcW w:type="dxa" w:w="2448"/>
+            <w:shd w:fill="F7FAFC"/>
+          </w:tcPr>
+          <w:p>
+            <w:r>
+              <w:rPr>
+                <w:rFonts w:ascii="Calibri" w:hAnsi="Calibri"/>
+                <w:color w:val="2D3748"/>
+                <w:sz w:val="19"/>
+              </w:rPr>
+              <w:t>Private SSH key allowing passwordless login.</w:t>
+            </w:r>
+          </w:p>
+        </w:tc>
+      </w:tr>
+      <w:tr>
+        <w:tc>
+          <w:tcPr>
+            <w:tcW w:type="dxa" w:w="1728"/>
+            <w:shd w:fill="FFFFFF"/>
+          </w:tcPr>
+          <w:p>
+            <w:r>
+              <w:rPr>
+                <w:rFonts w:ascii="Calibri" w:hAnsi="Calibri"/>
+                <w:color w:val="2D3748"/>
+                <w:sz w:val="19"/>
+              </w:rPr>
+              <w:t>PORT</w:t>
+            </w:r>
+          </w:p>
+        </w:tc>
+        <w:tc>
+          <w:tcPr>
+            <w:tcW w:type="dxa" w:w="2592"/>
+            <w:shd w:fill="FFFFFF"/>
+          </w:tcPr>
+          <w:p>
+            <w:r>
+              <w:rPr>
+                <w:rFonts w:ascii="Calibri" w:hAnsi="Calibri"/>
+                <w:color w:val="2D3748"/>
+                <w:sz w:val="19"/>
+              </w:rPr>
+              <w:t>3000</w:t>
+            </w:r>
+          </w:p>
+        </w:tc>
+        <w:tc>
+          <w:tcPr>
+            <w:tcW w:type="dxa" w:w="2592"/>
+            <w:shd w:fill="FFFFFF"/>
+          </w:tcPr>
+          <w:p>
+            <w:r>
+              <w:rPr>
+                <w:rFonts w:ascii="Calibri" w:hAnsi="Calibri"/>
+                <w:color w:val="2D3748"/>
+                <w:sz w:val="19"/>
+              </w:rPr>
+              <w:t>3000</w:t>
+            </w:r>
+          </w:p>
+        </w:tc>
+        <w:tc>
+          <w:tcPr>
+            <w:tcW w:type="dxa" w:w="2448"/>
+            <w:shd w:fill="FFFFFF"/>
+          </w:tcPr>
+          <w:p>
+            <w:r>
+              <w:rPr>
+                <w:rFonts w:ascii="Calibri" w:hAnsi="Calibri"/>
+                <w:color w:val="2D3748"/>
+                <w:sz w:val="19"/>
+              </w:rPr>
+              <w:t>The web server port configured in server.js.</w:t>
+            </w:r>
+          </w:p>
+        </w:tc>
+      </w:tr>
+    </w:tbl>
     <w:p>
       <w:pPr>
-        <w:pStyle w:val="ListBullet"/>
-        <w:spacing w:after="60" w:line="276" w:lineRule="auto"/>
+        <w:spacing w:before="200" w:after="80"/>
       </w:pPr>
       <w:r>
         <w:rPr>
-          <w:rFonts w:ascii="Calibri" w:hAnsi="Calibri"/>
+          <w:rFonts w:ascii="Arial" w:hAnsi="Arial"/>
           <w:b/>
           <w:color w:val="2D3748"/>
-          <w:sz w:val="22"/>
+          <w:sz w:val="26"/>
         </w:rPr>
-        <w:t xml:space="preserve">1. SSH Key Authentication: </w:t>
-      </w:r>
-      <w:r>
-        <w:rPr>
-          <w:rFonts w:ascii="Calibri" w:hAnsi="Calibri"/>
-          <w:color w:val="2D3748"/>
-          <w:sz w:val="22"/>
-        </w:rPr>
-        <w:t>Deployment authentication relies on a generated SSH Private Key (VPS_SSH_KEY) stored securely in GitHub Secrets. Passwords are NOT used or required in CI/CD secrets.</w:t>
+        <w:t>Key Architectural Takeaway:</w:t>
       </w:r>
     </w:p>
-    <w:p>
-      <w:pPr>
-        <w:pStyle w:val="ListBullet"/>
-        <w:spacing w:after="60" w:line="276" w:lineRule="auto"/>
-      </w:pPr>
-      <w:r>
-        <w:rPr>
-          <w:rFonts w:ascii="Calibri" w:hAnsi="Calibri"/>
-          <w:b/>
-          <w:color w:val="2D3748"/>
-          <w:sz w:val="22"/>
-        </w:rPr>
-        <w:t xml:space="preserve">2. Security Advantage: </w:t>
-      </w:r>
-      <w:r>
-        <w:rPr>
-          <w:rFonts w:ascii="Calibri" w:hAnsi="Calibri"/>
-          <w:color w:val="2D3748"/>
-          <w:sz w:val="22"/>
-        </w:rPr>
-        <w:t>SSH Keys eliminate the risk of password brute-force attacks, expired password lockouts, and interactive prompt failures during automated CI/CD runs.</w:t>
-      </w:r>
-    </w:p>
-    <w:p>
-      <w:pPr>
-        <w:pStyle w:val="ListBullet"/>
-        <w:spacing w:after="60" w:line="276" w:lineRule="auto"/>
-      </w:pPr>
-      <w:r>
-        <w:rPr>
-          <w:rFonts w:ascii="Calibri" w:hAnsi="Calibri"/>
-          <w:b/>
-          <w:color w:val="2D3748"/>
-          <w:sz w:val="22"/>
-        </w:rPr>
-        <w:t xml:space="preserve">3. Local Execution vs VPS: </w:t>
-      </w:r>
-      <w:r>
-        <w:rPr>
-          <w:rFonts w:ascii="Calibri" w:hAnsi="Calibri"/>
-          <w:color w:val="2D3748"/>
-          <w:sz w:val="22"/>
-        </w:rPr>
-        <w:t>For local development on WSL/Windows, you run node server.js or docker compose up directly without needing SSH keys or passwords.</w:t>
-      </w:r>
-    </w:p>
+    <w:tbl>
+      <w:tblPr>
+        <w:tblW w:type="auto" w:w="0"/>
+        <w:jc w:val="center"/>
+        <w:tblLook w:firstColumn="1" w:firstRow="1" w:lastColumn="0" w:lastRow="0" w:noHBand="0" w:noVBand="1" w:val="04A0"/>
+      </w:tblPr>
+      <w:tblGrid>
+        <w:gridCol w:w="9360"/>
+      </w:tblGrid>
+      <w:tr>
+        <w:tc>
+          <w:tcPr>
+            <w:tcW w:type="dxa" w:w="9360"/>
+            <w:shd w:fill="EDF2F7"/>
+            <w:tcBorders>
+              <w:left w:val="single" w:sz="24" w:space="0" w:color="3182CE"/>
+              <w:top w:val="none"/>
+              <w:right w:val="none"/>
+              <w:bottom w:val="none"/>
+            </w:tcBorders>
+          </w:tcPr>
+          <w:p>
+            <w:pPr>
+              <w:spacing w:before="120" w:after="120"/>
+            </w:pPr>
+            <w:r>
+              <w:rPr>
+                <w:rFonts w:ascii="Calibri" w:hAnsi="Calibri"/>
+                <w:i/>
+                <w:color w:val="2D3748"/>
+                <w:sz w:val="21"/>
+              </w:rPr>
+              <w:t>Key Takeaway: For local development (node server.js -&gt; http://localhost:3000), you only need GitHub to store your code. You do not need SSH cloud deployment secrets unless you buy a cloud VPS server in the future!</w:t>
+            </w:r>
+          </w:p>
+        </w:tc>
+      </w:tr>
+    </w:tbl>
     <w:p>
       <w:pPr>
         <w:spacing w:before="280" w:after="120"/>
@@ -419,94 +762,7 @@
           <w:color w:val="2B6CB0"/>
           <w:sz w:val="32"/>
         </w:rPr>
-        <w:t>5. Project Boundaries &amp; Relationship to MCP_job_search</w:t>
-      </w:r>
-    </w:p>
-    <w:p>
-      <w:pPr>
-        <w:spacing w:after="120" w:line="276" w:lineRule="auto"/>
-      </w:pPr>
-      <w:r>
-        <w:rPr>
-          <w:rFonts w:ascii="Calibri" w:hAnsi="Calibri"/>
-          <w:color w:val="2D3748"/>
-          <w:sz w:val="22"/>
-        </w:rPr>
-        <w:t>It is critical to distinguish between the two sub-projects in the repository:</w:t>
-      </w:r>
-    </w:p>
-    <w:p>
-      <w:pPr>
-        <w:pStyle w:val="ListBullet"/>
-        <w:spacing w:after="60" w:line="276" w:lineRule="auto"/>
-      </w:pPr>
-      <w:r>
-        <w:rPr>
-          <w:rFonts w:ascii="Calibri" w:hAnsi="Calibri"/>
-          <w:b/>
-          <w:color w:val="2D3748"/>
-          <w:sz w:val="22"/>
-        </w:rPr>
-        <w:t xml:space="preserve">1. apply/ (Root App): </w:t>
-      </w:r>
-      <w:r>
-        <w:rPr>
-          <w:rFonts w:ascii="Calibri" w:hAnsi="Calibri"/>
-          <w:color w:val="2D3748"/>
-          <w:sz w:val="22"/>
-        </w:rPr>
-        <w:t>Interactive local web dashboard (index.html) running on port 3000 for manual job search and visual link generation.</w:t>
-      </w:r>
-    </w:p>
-    <w:p>
-      <w:pPr>
-        <w:pStyle w:val="ListBullet"/>
-        <w:spacing w:after="60" w:line="276" w:lineRule="auto"/>
-      </w:pPr>
-      <w:r>
-        <w:rPr>
-          <w:rFonts w:ascii="Calibri" w:hAnsi="Calibri"/>
-          <w:b/>
-          <w:color w:val="2D3748"/>
-          <w:sz w:val="22"/>
-        </w:rPr>
-        <w:t xml:space="preserve">2. apply/MCP_job_search/ (Subproject): </w:t>
-      </w:r>
-      <w:r>
-        <w:rPr>
-          <w:rFonts w:ascii="Calibri" w:hAnsi="Calibri"/>
-          <w:color w:val="2D3748"/>
-          <w:sz w:val="22"/>
-        </w:rPr>
-        <w:t>Automated background cron worker (src/queues/jobScheduler.js) running every 6 hours with ChromaDB RAG vector deduplication, BullMQ + Redis, and Yahoo Nodemailer application email dispatcher.</w:t>
-      </w:r>
-    </w:p>
-    <w:p>
-      <w:pPr>
-        <w:spacing w:before="280" w:after="120"/>
-      </w:pPr>
-      <w:r>
-        <w:rPr>
-          <w:rFonts w:ascii="Arial" w:hAnsi="Arial"/>
-          <w:b/>
-          <w:color w:val="2B6CB0"/>
-          <w:sz w:val="32"/>
-        </w:rPr>
-        <w:t>6. Deployment &amp; Execution Instructions</w:t>
-      </w:r>
-    </w:p>
-    <w:p>
-      <w:pPr>
-        <w:spacing w:before="200" w:after="80"/>
-      </w:pPr>
-      <w:r>
-        <w:rPr>
-          <w:rFonts w:ascii="Arial" w:hAnsi="Arial"/>
-          <w:b/>
-          <w:color w:val="2D3748"/>
-          <w:sz w:val="26"/>
-        </w:rPr>
-        <w:t>Running via Node.js in WSL:</w:t>
+        <w:t>5. Deployment &amp; Execution Instructions</w:t>
       </w:r>
     </w:p>
     <w:tbl>

</xml_diff>